<commit_message>
Servidor | uploads e ajustes dentro dele
</commit_message>
<xml_diff>
--- a/uploads/Proposta/PropostaCIOSP 2027_CIOSP _.docx
+++ b/uploads/Proposta/PropostaCIOSP 2027_CIOSP _.docx
@@ -614,27 +614,61 @@
             <w:rPr>
               <w:rFonts w:ascii="Abel" w:hAnsi="Abel" w:cs="Abel"/>
             </w:rPr>
-            <w:t xml:space="preserve">ATENDIMENTO OPERACIONAL</w:t>
+            <w:t xml:space="preserve"/>
+          </w:r>
+          <w:r>
+            <w:rPr>
+              <w:b/>
+              <w:i/>
+              <w:rFonts w:ascii="Abel" w:hAnsi="Abel" w:cs="Abel"/>
+            </w:rPr>
+            <w:t xml:space="preserve">ATUALIZAÇÃO DE PLANTA</w:t>
+          </w:r>
+          <w:r>
+            <w:rPr>
+              <w:rFonts w:ascii="Abel" w:hAnsi="Abel" w:cs="Abel"/>
+            </w:rPr>
+            <w:t xml:space="preserve"/>
+            <w:br/>
+            <w:t xml:space="preserve">● Atualização da Planta (2x por semana via e-mail)</w:t>
+            <w:br/>
+            <w:t xml:space="preserve">● Suporte Técnico durante a Comercialização</w:t>
             <w:br/>
             <w:t xml:space="preserve"/>
             <w:br/>
-            <w:t xml:space="preserve">PRODUTOR</w:t>
+            <w:t xml:space="preserve">• 1 AtualizaçãO De Planta, 1 Diária(s), de: 20/01/2027 até: 20/01/2027</w:t>
             <w:br/>
             <w:t xml:space="preserve"/>
             <w:br/>
-            <w:t xml:space="preserve">1 ATENDIMENTO OPERACIONAL</w:t>
+            <w:t xml:space="preserve"/>
             <w:br/>
             <w:t xml:space="preserve"/>
             <w:br/>
-            <w:t xml:space="preserve">ATENDIMENTO OPERACIONAL</w:t>
+            <w:t xml:space="preserve"/>
+          </w:r>
+          <w:r>
+            <w:rPr>
+              <w:b/>
+              <w:i/>
+              <w:rFonts w:ascii="Abel" w:hAnsi="Abel" w:cs="Abel"/>
+            </w:rPr>
+            <w:t xml:space="preserve">ANALISTA DE PROJETOS</w:t>
+          </w:r>
+          <w:r>
+            <w:rPr>
+              <w:rFonts w:ascii="Abel" w:hAnsi="Abel" w:cs="Abel"/>
+            </w:rPr>
+            <w:t xml:space="preserve"/>
+            <w:br/>
+            <w:t xml:space="preserve"> Sistema on-line para a análise do projeto e documentação;</w:t>
+            <w:br/>
+            <w:t xml:space="preserve"> Análise dos projetos de acordo com as normas de montagem do evento;</w:t>
+            <w:br/>
+            <w:t xml:space="preserve"> Recebimento da documentação dos estandes: (A.R.T. ou R.R.T. e Termo de Responsabilidade);</w:t>
             <w:br/>
             <w:t xml:space="preserve"/>
             <w:br/>
-            <w:t xml:space="preserve">PRODUTOR</w:t>
-            <w:br/>
-            <w:t xml:space="preserve"/>
-            <w:br/>
-            <w:t xml:space="preserve">1 ATENDIMENTO OPERACIONAL</w:t>
+            <w:t xml:space="preserve">• 1 Analista De Projetos, 60 Diária(s), de: 23/11/2026 até: 21/01/2027</w:t>
           </w:r>
         </w:t>
       </w:r>
@@ -964,7 +998,7 @@
           <w:sz w:val="24"/>
           <w:szCs w:val="24"/>
         </w:rPr>
-        <w:t xml:space="preserve">• 4 Fiscal De LogíStica, (DIURNO), 12 Diária(s), de: 21/01/2027 até: 01/02/2027</w:t>
+        <w:t xml:space="preserve">• 2 Coordenador Operacional 1, (MARCAÇÃO), 1 Diária(s), de: 20/01/2027 até: 20/01/2027</w:t>
       </w:r>
     </w:p>
     <w:p>
@@ -984,7 +1018,7 @@
           <w:sz w:val="24"/>
           <w:szCs w:val="24"/>
         </w:rPr>
-        <w:t xml:space="preserve">• 2 Coordenador Operacional 1, (MARCAÇÃO), 1 Diária(s), de: 20/01/2027 até: 20/01/2027</w:t>
+        <w:t xml:space="preserve">• 1 Atendimento Operacional PavilhãO - Mono, (MÁRCIA), 10 Diária(s), de: 21/01/2027 até: 30/01/2027</w:t>
       </w:r>
     </w:p>
     <w:p>
@@ -1024,7 +1058,7 @@
           <w:sz w:val="24"/>
           <w:szCs w:val="24"/>
         </w:rPr>
-        <w:t xml:space="preserve">• 2 Fiscal Noturno, (NOTURNO 2), 6 Diária(s), de: 21/01/2027 até: 26/01/2027</w:t>
+        <w:t xml:space="preserve">• 1 Fiscal Noturno, (NOTURNO 2), 6 Diária(s), de: 21/01/2027 até: 26/01/2027</w:t>
       </w:r>
     </w:p>
     <w:p>
@@ -1144,7 +1178,7 @@
           <w:sz w:val="24"/>
           <w:szCs w:val="24"/>
         </w:rPr>
-        <w:t xml:space="preserve">• 1 Coordenador De ServiçOs, (PERIODO 2), 10 Diária(s), de: 22/01/2027 até: 31/01/2027</w:t>
+        <w:t xml:space="preserve">• 6 Ajudante De MarcaçãO, 1 Diária(s), de: 20/01/2027 até: 20/01/2027</w:t>
       </w:r>
     </w:p>
     <w:p>
@@ -1164,7 +1198,7 @@
           <w:sz w:val="24"/>
           <w:szCs w:val="24"/>
         </w:rPr>
-        <w:t xml:space="preserve">• 6 Ajudante De MarcaçãO, 1 Diária(s), de: 20/01/2027 até: 20/01/2027</w:t>
+        <w:t xml:space="preserve">• 2 Coordenador De ServiçOs, 12 Diária(s), de: 21/01/2027 até: 01/02/2027</w:t>
       </w:r>
     </w:p>
     <w:p>
@@ -1184,7 +1218,7 @@
           <w:sz w:val="24"/>
           <w:szCs w:val="24"/>
         </w:rPr>
-        <w:t xml:space="preserve">• 1 AtualizaçãO De Planta, 1 Diária(s), de: 20/01/2027 até: 20/01/2027</w:t>
+        <w:t xml:space="preserve">• 1 Coordenador Operacional 1, 12 Diária(s), de: 21/01/2027 até: 01/02/2027</w:t>
       </w:r>
     </w:p>
     <w:p>
@@ -1204,7 +1238,7 @@
           <w:sz w:val="24"/>
           <w:szCs w:val="24"/>
         </w:rPr>
-        <w:t xml:space="preserve">• 1 Coordenador De ServiçOs, 12 Diária(s), de: 21/01/2027 até: 01/02/2027</w:t>
+        <w:t xml:space="preserve">• 4 Fiscal De LogíStica, 12 Diária(s), de: 21/01/2027 até: 01/02/2027</w:t>
       </w:r>
     </w:p>
     <w:p>
@@ -1224,7 +1258,7 @@
           <w:sz w:val="24"/>
           <w:szCs w:val="24"/>
         </w:rPr>
-        <w:t xml:space="preserve">• 1 Coordenador Operacional 1, 12 Diária(s), de: 21/01/2027 até: 01/02/2027</w:t>
+        <w:t xml:space="preserve">• 1 Atendimento Operacional PavilhãO - BilíNgue, (SIDNEY), 10 Diária(s), de: 21/01/2027 até: 30/01/2027</w:t>
       </w:r>
     </w:p>
     <w:p>
@@ -1244,7 +1278,7 @@
           <w:sz w:val="24"/>
           <w:szCs w:val="24"/>
         </w:rPr>
-        <w:t xml:space="preserve">• 1 Fiscal Diurno, (TENDA), 12 Diária(s), de: 21/01/2027 até: 01/02/2027</w:t>
+        <w:t xml:space="preserve">• 13 Fiscal De MarcaçãO, (TODOS OS PAVILHÕES), 1 Diária(s), de: 20/01/2027 até: 20/01/2027</w:t>
       </w:r>
     </w:p>
     <w:p>
@@ -1264,47 +1298,7 @@
           <w:sz w:val="24"/>
           <w:szCs w:val="24"/>
         </w:rPr>
-        <w:t xml:space="preserve">• 13 Fiscal De MarcaçãO, (TODOS OS PAVILHÕES), 1 Diária(s), de: 20/01/2027 até: 20/01/2027</w:t>
-      </w:r>
-    </w:p>
-    <w:p>
-      <w:pPr>
-        <w:pStyle w:val="PargrafodaLista"/>
-        <w:spacing w:line="285" w:lineRule="atLeast"/>
-        <w:ind w:left="0"/>
-        <w:rPr>
-          <w:rFonts w:ascii="Abel" w:hAnsi="Abel"/>
-          <w:sz w:val="24"/>
-          <w:szCs w:val="24"/>
-        </w:rPr>
-      </w:pPr>
-      <w:r>
-        <w:rPr>
-          <w:rFonts w:ascii="Abel" w:hAnsi="Abel"/>
-          <w:sz w:val="24"/>
-          <w:szCs w:val="24"/>
-        </w:rPr>
-        <w:t xml:space="preserve">• 1 Fiscal Noturno, (TODOS OS PAVILHÕES), 6 Diária(s), de: 21/01/2027 até: 26/01/2027</w:t>
-      </w:r>
-    </w:p>
-    <w:p>
-      <w:pPr>
-        <w:pStyle w:val="PargrafodaLista"/>
-        <w:spacing w:line="285" w:lineRule="atLeast"/>
-        <w:ind w:left="0"/>
-        <w:rPr>
-          <w:rFonts w:ascii="Abel" w:hAnsi="Abel"/>
-          <w:sz w:val="24"/>
-          <w:szCs w:val="24"/>
-        </w:rPr>
-      </w:pPr>
-      <w:r>
-        <w:rPr>
-          <w:rFonts w:ascii="Abel" w:hAnsi="Abel"/>
-          <w:sz w:val="24"/>
-          <w:szCs w:val="24"/>
-        </w:rPr>
-        <w:t xml:space="preserve">• 3 Fiscal Noturno, (TODOS OS PAVILHÕES), 12 Diária(s), de: 21/01/2027 até: 01/02/2027</w:t>
+        <w:t xml:space="preserve">• 2 Fiscal Noturno, (TODOS OS PAVILHÕES), 12 Diária(s), de: 21/01/2027 até: 01/02/2027</w:t>
       </w:r>
     </w:p>
     <w:p>
@@ -1579,7 +1573,7 @@
           <w:sz w:val="24"/>
           <w:szCs w:val="24"/>
         </w:rPr>
-        <w:t xml:space="preserve">R$ 207.148,12</w:t>
+        <w:t xml:space="preserve">R$ 215.254,79</w:t>
       </w:r>
       <w:r>
         <w:rPr>
@@ -1758,7 +1752,7 @@
           <w:i/>
           <w:iCs/>
         </w:rPr>
-        <w:t xml:space="preserve">05/03/2026</w:t>
+        <w:t xml:space="preserve">27/03/2026</w:t>
       </w:r>
     </w:p>
     <w:p>

</xml_diff>